<commit_message>
Finished ch.5 added an image and add the source
</commit_message>
<xml_diff>
--- a/WebDesign/Source Credit.docx
+++ b/WebDesign/Source Credit.docx
@@ -44,6 +44,14 @@
       </w:r>
       <w:r>
         <w:t xml:space="preserve"> JPEG: Textbook</w:t>
+      </w:r>
+    </w:p>
+    <w:p>
+      <w:r>
+        <w:t>Vulnerability Life Cycle</w:t>
+      </w:r>
+      <w:r>
+        <w:t>: Copilot</w:t>
       </w:r>
     </w:p>
     <w:p/>

</xml_diff>